<commit_message>
feat(ecosystem): full autonomous upgrade of core cortex-m beast substrate, platforms, and PRD/SRS books
</commit_message>
<xml_diff>
--- a/CORTEX_Ecosystem_PRD_SRS_Pack/00_CORTEX_M_Core_PRD_SRS.docx
+++ b/CORTEX_Ecosystem_PRD_SRS_Pack/00_CORTEX_M_Core_PRD_SRS.docx
@@ -3825,6 +3825,157 @@
         <w:t>- **CLI &amp; REST Server**: `src/cortex_m/cli.py`, `src/cortex_m/server/app.py`</w:t>
       </w:r>
     </w:p>
+    <w:p>
+      <w:pPr>
+        <w:pStyle w:val="Heading1"/>
+      </w:pPr>
+      <w:r>
+        <w:t>Technical Architecture &amp; Mathematical Formulations</w:t>
+      </w:r>
+    </w:p>
+    <w:p>
+      <w:r>
+        <w:t>### Technical Architecture &amp; Mathematical Foundations: CORTEX-M Core Platform</w:t>
+      </w:r>
+    </w:p>
+    <w:p>
+      <w:r>
+        <w:t>- **Continuous Modern Hopfield Attractors**: Core associative memory relies on continuous state relaxation governed by the energy function:</w:t>
+      </w:r>
+    </w:p>
+    <w:p>
+      <w:r>
+        <w:t>$$E(x) = -\frac{1}{\beta} \text{lse}(\beta M x) + \frac{1}{2} \|x\|^2$$</w:t>
+      </w:r>
+    </w:p>
+    <w:p>
+      <w:r>
+        <w:t>where state iteration follows $x_{t+1} = M^T \text{softmax}(\beta M x_t)$, providing exponential memory capacity and guaranteed Lyapunov stability (energy strictly decreases along recurrent trajectories).</w:t>
+      </w:r>
+    </w:p>
+    <w:p>
+      <w:r>
+        <w:t>- **Batch Attractor Parallel Convergence**: High-throughput vectorized Modern Hopfield convergence across query batches $X \in \mathbb{R}^{B \times d}$:</w:t>
+      </w:r>
+    </w:p>
+    <w:p>
+      <w:r>
+        <w:t>$$X_{t+1} = \text{normalize}\left(\text{softmax}(\beta X_t M^T) M + \gamma \frac{X_t W^T}{\|W\|}\right)$$</w:t>
+      </w:r>
+    </w:p>
+    <w:p>
+      <w:r>
+        <w:t>- **Analytical Lyapunov Energy Gradient &amp; Landscape Profiling**: Exact energy gradient $\nabla E(x) = x - M^T \text{softmax}(\beta M x)$ evaluates local basin depth, barrier height $\Delta E = \bar{E}_{\text{rim}} - E^*$, and stability margins.</w:t>
+      </w:r>
+    </w:p>
+    <w:p>
+      <w:r>
+        <w:t>- **Truncated SVD Matrix Factorization**: Synaptic parameter compression via rank-$k$ factorization:</w:t>
+      </w:r>
+    </w:p>
+    <w:p>
+      <w:r>
+        <w:t>$$W \approx U_k \Sigma_k V_k^T$$</w:t>
+      </w:r>
+    </w:p>
+    <w:p>
+      <w:r>
+        <w:t>achieving ~2x compression while preserving zero diagonal and exact matrix symmetry.</w:t>
+      </w:r>
+    </w:p>
+    <w:p>
+      <w:r>
+        <w:t>- **Counterfactual Basin Stress Testing**: Adversarial noise injection evaluating Lyapunov basin stability:</w:t>
+      </w:r>
+    </w:p>
+    <w:p>
+      <w:r>
+        <w:t>$$S_{\text{basin}} = \frac{1}{N} \sum_{i=1}^N \mathbb{I}(f(x + \epsilon_i) = f(x))$$</w:t>
+      </w:r>
+    </w:p>
+    <w:p>
+      <w:r>
+        <w:t>differentiating verified attractor basins from fragile hallucinations.</w:t>
+      </w:r>
+    </w:p>
+    <w:p>
+      <w:r>
+        <w:t>- **Dynamic Temperature Annealing**: Adaptive inverse temperature $\beta(E)$ sharpening retrieval for well-settled memories ($E &lt; -1.0$) and relaxing for exploratory association.</w:t>
+      </w:r>
+    </w:p>
+    <w:p>
+      <w:r>
+        <w:t>- **Associative Reasoning Chains**: Multi-hop continuous attractor traversal projecting out visited basins to explore adjacent semantic attractors without prompt engineering.</w:t>
+      </w:r>
+    </w:p>
+    <w:p>
+      <w:r>
+        <w:t>- **Gram-Schmidt Memory Fusion**: Composite prototype synthesis with orthogonal projection against non-target memories to guarantee zero catastrophic interference.</w:t>
+      </w:r>
+    </w:p>
+    <w:p>
+      <w:r>
+        <w:t>- **Orthogonal Synaptic Grafting ($P_\perp$)**: Zero-collateral parameter integration uses exact null-space projection:</w:t>
+      </w:r>
+    </w:p>
+    <w:p>
+      <w:r>
+        <w:t>$$P_\perp = I - Q_B Q_B^T$$</w:t>
+      </w:r>
+    </w:p>
+    <w:p>
+      <w:r>
+        <w:t>guaranteeing $P_\perp X_B = 0$ ($0.0\%$ collateral interference to existing basins).</w:t>
+      </w:r>
+    </w:p>
+    <w:p>
+      <w:pPr>
+        <w:pStyle w:val="Heading1"/>
+      </w:pPr>
+      <w:r>
+        <w:t>Implemented Codebase Traceability</w:t>
+      </w:r>
+    </w:p>
+    <w:p>
+      <w:r>
+        <w:t>### Implemented Codebase Traceability</w:t>
+      </w:r>
+    </w:p>
+    <w:p>
+      <w:r>
+        <w:t>- **Core Architecture &amp; Beast Neural Substrate**: `src/cortex_m/cortex_v2.py` (`CortexV2`)</w:t>
+      </w:r>
+    </w:p>
+    <w:p>
+      <w:r>
+        <w:t>- **Continuous Synaptic Memory**: `src/cortex_m/pathway/synaptic_memory.py` (`SynapticMemoryNetwork`)</w:t>
+      </w:r>
+    </w:p>
+    <w:p>
+      <w:r>
+        <w:t>- **Runtime &amp; Contracts**: `src/cortex_m/core/runtime.py`, `src/cortex_m/core/contracts/`</w:t>
+      </w:r>
+    </w:p>
+    <w:p>
+      <w:r>
+        <w:t>- **Developmental Sleep Consolidation**: `src/cortex_m/learning/consolidation.py` (`NocturnalSleepConsolidator`)</w:t>
+      </w:r>
+    </w:p>
+    <w:p>
+      <w:r>
+        <w:t>- **Grafting &amp; Orthogonality**: `src/cortex_m/learning/grafting.py` (`SynapticKnowledgePackager`)</w:t>
+      </w:r>
+    </w:p>
+    <w:p>
+      <w:r>
+        <w:t>- **Universal Gateway**: `src/cortex_m/gateway.py` (`EcosystemGateway`)</w:t>
+      </w:r>
+    </w:p>
+    <w:p>
+      <w:r>
+        <w:t>- **CLI &amp; REST Server**: `src/cortex_m/cli.py`, `src/cortex_m/server/app.py`</w:t>
+      </w:r>
+    </w:p>
     <w:sectPr>
       <w:footerReference w:type="default" r:id="rId9"/>
       <w:pgSz w:w="12240" w:h="15840"/>

</xml_diff>